<commit_message>
Sales kit: benchmark refresh — 6 capabilities, AI governance + CLM sections, demo proof points
</commit_message>
<xml_diff>
--- a/public/sales-kit/FlowSync_Benchmark_Competitivo_ES.docx
+++ b/public/sales-kit/FlowSync_Benchmark_Competitivo_ES.docx
@@ -2641,6 +2641,1284 @@
                 <w:szCs w:val="20"/>
               </w:rPr>
               <w:t xml:space="preserve">—</w:t>
+            </w:r>
+          </w:p>
+        </w:tc>
+      </w:tr>
+      <w:tr>
+        <w:trPr>
+          <w:tblHeader w:val="false"/>
+        </w:trPr>
+        <w:tc>
+          <w:tcPr>
+            <w:tcW w:type="dxa" w:w="3200"/>
+            <w:tcMar>
+              <w:top w:type="dxa" w:w="80"/>
+              <w:left w:type="dxa" w:w="120"/>
+              <w:bottom w:type="dxa" w:w="80"/>
+              <w:right w:type="dxa" w:w="120"/>
+            </w:tcMar>
+          </w:tcPr>
+          <w:p>
+            <w:pPr>
+              <w:spacing w:after="0"/>
+            </w:pPr>
+            <w:r>
+              <w:rPr>
+                <w:b w:val="false"/>
+                <w:bCs w:val="false"/>
+                <w:color w:val="1E293B"/>
+                <w:sz w:val="20"/>
+                <w:szCs w:val="20"/>
+              </w:rPr>
+              <w:t xml:space="preserve">Líneas base bloqueadas con varianza de cronograma y presupuesto</w:t>
+            </w:r>
+          </w:p>
+        </w:tc>
+        <w:tc>
+          <w:tcPr>
+            <w:tcW w:type="dxa" w:w="900"/>
+            <w:tcMar>
+              <w:top w:type="dxa" w:w="80"/>
+              <w:left w:type="dxa" w:w="120"/>
+              <w:bottom w:type="dxa" w:w="80"/>
+              <w:right w:type="dxa" w:w="120"/>
+            </w:tcMar>
+          </w:tcPr>
+          <w:p>
+            <w:pPr>
+              <w:spacing w:after="0"/>
+            </w:pPr>
+            <w:r>
+              <w:rPr>
+                <w:b w:val="false"/>
+                <w:bCs w:val="false"/>
+                <w:color w:val="1E293B"/>
+                <w:sz w:val="20"/>
+                <w:szCs w:val="20"/>
+              </w:rPr>
+              <w:t xml:space="preserve">✔</w:t>
+            </w:r>
+          </w:p>
+        </w:tc>
+        <w:tc>
+          <w:tcPr>
+            <w:tcW w:type="dxa" w:w="1150"/>
+            <w:tcMar>
+              <w:top w:type="dxa" w:w="80"/>
+              <w:left w:type="dxa" w:w="120"/>
+              <w:bottom w:type="dxa" w:w="80"/>
+              <w:right w:type="dxa" w:w="120"/>
+            </w:tcMar>
+          </w:tcPr>
+          <w:p>
+            <w:pPr>
+              <w:spacing w:after="0"/>
+            </w:pPr>
+            <w:r>
+              <w:rPr>
+                <w:b w:val="false"/>
+                <w:bCs w:val="false"/>
+                <w:color w:val="1E293B"/>
+                <w:sz w:val="20"/>
+                <w:szCs w:val="20"/>
+              </w:rPr>
+              <w:t xml:space="preserve">✔</w:t>
+            </w:r>
+          </w:p>
+        </w:tc>
+        <w:tc>
+          <w:tcPr>
+            <w:tcW w:type="dxa" w:w="900"/>
+            <w:tcMar>
+              <w:top w:type="dxa" w:w="80"/>
+              <w:left w:type="dxa" w:w="120"/>
+              <w:bottom w:type="dxa" w:w="80"/>
+              <w:right w:type="dxa" w:w="120"/>
+            </w:tcMar>
+          </w:tcPr>
+          <w:p>
+            <w:pPr>
+              <w:spacing w:after="0"/>
+            </w:pPr>
+            <w:r>
+              <w:rPr>
+                <w:b w:val="false"/>
+                <w:bCs w:val="false"/>
+                <w:color w:val="1E293B"/>
+                <w:sz w:val="20"/>
+                <w:szCs w:val="20"/>
+              </w:rPr>
+              <w:t xml:space="preserve">◐</w:t>
+            </w:r>
+          </w:p>
+        </w:tc>
+        <w:tc>
+          <w:tcPr>
+            <w:tcW w:type="dxa" w:w="800"/>
+            <w:tcMar>
+              <w:top w:type="dxa" w:w="80"/>
+              <w:left w:type="dxa" w:w="120"/>
+              <w:bottom w:type="dxa" w:w="80"/>
+              <w:right w:type="dxa" w:w="120"/>
+            </w:tcMar>
+          </w:tcPr>
+          <w:p>
+            <w:pPr>
+              <w:spacing w:after="0"/>
+            </w:pPr>
+            <w:r>
+              <w:rPr>
+                <w:b w:val="false"/>
+                <w:bCs w:val="false"/>
+                <w:color w:val="1E293B"/>
+                <w:sz w:val="20"/>
+                <w:szCs w:val="20"/>
+              </w:rPr>
+              <w:t xml:space="preserve">—</w:t>
+            </w:r>
+          </w:p>
+        </w:tc>
+        <w:tc>
+          <w:tcPr>
+            <w:tcW w:type="dxa" w:w="950"/>
+            <w:tcMar>
+              <w:top w:type="dxa" w:w="80"/>
+              <w:left w:type="dxa" w:w="120"/>
+              <w:bottom w:type="dxa" w:w="80"/>
+              <w:right w:type="dxa" w:w="120"/>
+            </w:tcMar>
+          </w:tcPr>
+          <w:p>
+            <w:pPr>
+              <w:spacing w:after="0"/>
+            </w:pPr>
+            <w:r>
+              <w:rPr>
+                <w:b w:val="false"/>
+                <w:bCs w:val="false"/>
+                <w:color w:val="1E293B"/>
+                <w:sz w:val="20"/>
+                <w:szCs w:val="20"/>
+              </w:rPr>
+              <w:t xml:space="preserve">◐</w:t>
+            </w:r>
+          </w:p>
+        </w:tc>
+        <w:tc>
+          <w:tcPr>
+            <w:tcW w:type="dxa" w:w="800"/>
+            <w:tcMar>
+              <w:top w:type="dxa" w:w="80"/>
+              <w:left w:type="dxa" w:w="120"/>
+              <w:bottom w:type="dxa" w:w="80"/>
+              <w:right w:type="dxa" w:w="120"/>
+            </w:tcMar>
+          </w:tcPr>
+          <w:p>
+            <w:pPr>
+              <w:spacing w:after="0"/>
+            </w:pPr>
+            <w:r>
+              <w:rPr>
+                <w:b w:val="false"/>
+                <w:bCs w:val="false"/>
+                <w:color w:val="1E293B"/>
+                <w:sz w:val="20"/>
+                <w:szCs w:val="20"/>
+              </w:rPr>
+              <w:t xml:space="preserve">◐</w:t>
+            </w:r>
+          </w:p>
+        </w:tc>
+        <w:tc>
+          <w:tcPr>
+            <w:tcW w:type="dxa" w:w="800"/>
+            <w:tcMar>
+              <w:top w:type="dxa" w:w="80"/>
+              <w:left w:type="dxa" w:w="120"/>
+              <w:bottom w:type="dxa" w:w="80"/>
+              <w:right w:type="dxa" w:w="120"/>
+            </w:tcMar>
+          </w:tcPr>
+          <w:p>
+            <w:pPr>
+              <w:spacing w:after="0"/>
+            </w:pPr>
+            <w:r>
+              <w:rPr>
+                <w:b w:val="false"/>
+                <w:bCs w:val="false"/>
+                <w:color w:val="1E293B"/>
+                <w:sz w:val="20"/>
+                <w:szCs w:val="20"/>
+              </w:rPr>
+              <w:t xml:space="preserve">—</w:t>
+            </w:r>
+          </w:p>
+        </w:tc>
+      </w:tr>
+      <w:tr>
+        <w:trPr>
+          <w:tblHeader w:val="false"/>
+        </w:trPr>
+        <w:tc>
+          <w:tcPr>
+            <w:tcW w:type="dxa" w:w="3200"/>
+            <w:tcMar>
+              <w:top w:type="dxa" w:w="80"/>
+              <w:left w:type="dxa" w:w="120"/>
+              <w:bottom w:type="dxa" w:w="80"/>
+              <w:right w:type="dxa" w:w="120"/>
+            </w:tcMar>
+          </w:tcPr>
+          <w:p>
+            <w:pPr>
+              <w:spacing w:after="0"/>
+            </w:pPr>
+            <w:r>
+              <w:rPr>
+                <w:b w:val="false"/>
+                <w:bCs w:val="false"/>
+                <w:color w:val="1E293B"/>
+                <w:sz w:val="20"/>
+                <w:szCs w:val="20"/>
+              </w:rPr>
+              <w:t xml:space="preserve">Ciclo de vida de contratos (CLM): acuerdos empresariales, servicio prepagado, facturación desde trabajo registrado</w:t>
+            </w:r>
+          </w:p>
+        </w:tc>
+        <w:tc>
+          <w:tcPr>
+            <w:tcW w:type="dxa" w:w="900"/>
+            <w:tcMar>
+              <w:top w:type="dxa" w:w="80"/>
+              <w:left w:type="dxa" w:w="120"/>
+              <w:bottom w:type="dxa" w:w="80"/>
+              <w:right w:type="dxa" w:w="120"/>
+            </w:tcMar>
+          </w:tcPr>
+          <w:p>
+            <w:pPr>
+              <w:spacing w:after="0"/>
+            </w:pPr>
+            <w:r>
+              <w:rPr>
+                <w:b w:val="false"/>
+                <w:bCs w:val="false"/>
+                <w:color w:val="1E293B"/>
+                <w:sz w:val="20"/>
+                <w:szCs w:val="20"/>
+              </w:rPr>
+              <w:t xml:space="preserve">✔</w:t>
+            </w:r>
+          </w:p>
+        </w:tc>
+        <w:tc>
+          <w:tcPr>
+            <w:tcW w:type="dxa" w:w="1150"/>
+            <w:tcMar>
+              <w:top w:type="dxa" w:w="80"/>
+              <w:left w:type="dxa" w:w="120"/>
+              <w:bottom w:type="dxa" w:w="80"/>
+              <w:right w:type="dxa" w:w="120"/>
+            </w:tcMar>
+          </w:tcPr>
+          <w:p>
+            <w:pPr>
+              <w:spacing w:after="0"/>
+            </w:pPr>
+            <w:r>
+              <w:rPr>
+                <w:b w:val="false"/>
+                <w:bCs w:val="false"/>
+                <w:color w:val="1E293B"/>
+                <w:sz w:val="20"/>
+                <w:szCs w:val="20"/>
+              </w:rPr>
+              <w:t xml:space="preserve">—</w:t>
+            </w:r>
+          </w:p>
+        </w:tc>
+        <w:tc>
+          <w:tcPr>
+            <w:tcW w:type="dxa" w:w="900"/>
+            <w:tcMar>
+              <w:top w:type="dxa" w:w="80"/>
+              <w:left w:type="dxa" w:w="120"/>
+              <w:bottom w:type="dxa" w:w="80"/>
+              <w:right w:type="dxa" w:w="120"/>
+            </w:tcMar>
+          </w:tcPr>
+          <w:p>
+            <w:pPr>
+              <w:spacing w:after="0"/>
+            </w:pPr>
+            <w:r>
+              <w:rPr>
+                <w:b w:val="false"/>
+                <w:bCs w:val="false"/>
+                <w:color w:val="1E293B"/>
+                <w:sz w:val="20"/>
+                <w:szCs w:val="20"/>
+              </w:rPr>
+              <w:t xml:space="preserve">—</w:t>
+            </w:r>
+          </w:p>
+        </w:tc>
+        <w:tc>
+          <w:tcPr>
+            <w:tcW w:type="dxa" w:w="800"/>
+            <w:tcMar>
+              <w:top w:type="dxa" w:w="80"/>
+              <w:left w:type="dxa" w:w="120"/>
+              <w:bottom w:type="dxa" w:w="80"/>
+              <w:right w:type="dxa" w:w="120"/>
+            </w:tcMar>
+          </w:tcPr>
+          <w:p>
+            <w:pPr>
+              <w:spacing w:after="0"/>
+            </w:pPr>
+            <w:r>
+              <w:rPr>
+                <w:b w:val="false"/>
+                <w:bCs w:val="false"/>
+                <w:color w:val="1E293B"/>
+                <w:sz w:val="20"/>
+                <w:szCs w:val="20"/>
+              </w:rPr>
+              <w:t xml:space="preserve">—</w:t>
+            </w:r>
+          </w:p>
+        </w:tc>
+        <w:tc>
+          <w:tcPr>
+            <w:tcW w:type="dxa" w:w="950"/>
+            <w:tcMar>
+              <w:top w:type="dxa" w:w="80"/>
+              <w:left w:type="dxa" w:w="120"/>
+              <w:bottom w:type="dxa" w:w="80"/>
+              <w:right w:type="dxa" w:w="120"/>
+            </w:tcMar>
+          </w:tcPr>
+          <w:p>
+            <w:pPr>
+              <w:spacing w:after="0"/>
+            </w:pPr>
+            <w:r>
+              <w:rPr>
+                <w:b w:val="false"/>
+                <w:bCs w:val="false"/>
+                <w:color w:val="1E293B"/>
+                <w:sz w:val="20"/>
+                <w:szCs w:val="20"/>
+              </w:rPr>
+              <w:t xml:space="preserve">—</w:t>
+            </w:r>
+          </w:p>
+        </w:tc>
+        <w:tc>
+          <w:tcPr>
+            <w:tcW w:type="dxa" w:w="800"/>
+            <w:tcMar>
+              <w:top w:type="dxa" w:w="80"/>
+              <w:left w:type="dxa" w:w="120"/>
+              <w:bottom w:type="dxa" w:w="80"/>
+              <w:right w:type="dxa" w:w="120"/>
+            </w:tcMar>
+          </w:tcPr>
+          <w:p>
+            <w:pPr>
+              <w:spacing w:after="0"/>
+            </w:pPr>
+            <w:r>
+              <w:rPr>
+                <w:b w:val="false"/>
+                <w:bCs w:val="false"/>
+                <w:color w:val="1E293B"/>
+                <w:sz w:val="20"/>
+                <w:szCs w:val="20"/>
+              </w:rPr>
+              <w:t xml:space="preserve">—</w:t>
+            </w:r>
+          </w:p>
+        </w:tc>
+        <w:tc>
+          <w:tcPr>
+            <w:tcW w:type="dxa" w:w="800"/>
+            <w:tcMar>
+              <w:top w:type="dxa" w:w="80"/>
+              <w:left w:type="dxa" w:w="120"/>
+              <w:bottom w:type="dxa" w:w="80"/>
+              <w:right w:type="dxa" w:w="120"/>
+            </w:tcMar>
+          </w:tcPr>
+          <w:p>
+            <w:pPr>
+              <w:spacing w:after="0"/>
+            </w:pPr>
+            <w:r>
+              <w:rPr>
+                <w:b w:val="false"/>
+                <w:bCs w:val="false"/>
+                <w:color w:val="1E293B"/>
+                <w:sz w:val="20"/>
+                <w:szCs w:val="20"/>
+              </w:rPr>
+              <w:t xml:space="preserve">—</w:t>
+            </w:r>
+          </w:p>
+        </w:tc>
+      </w:tr>
+      <w:tr>
+        <w:trPr>
+          <w:tblHeader w:val="false"/>
+        </w:trPr>
+        <w:tc>
+          <w:tcPr>
+            <w:tcW w:type="dxa" w:w="3200"/>
+            <w:tcMar>
+              <w:top w:type="dxa" w:w="80"/>
+              <w:left w:type="dxa" w:w="120"/>
+              <w:bottom w:type="dxa" w:w="80"/>
+              <w:right w:type="dxa" w:w="120"/>
+            </w:tcMar>
+          </w:tcPr>
+          <w:p>
+            <w:pPr>
+              <w:spacing w:after="0"/>
+            </w:pPr>
+            <w:r>
+              <w:rPr>
+                <w:b w:val="false"/>
+                <w:bCs w:val="false"/>
+                <w:color w:val="1E293B"/>
+                <w:sz w:val="20"/>
+                <w:szCs w:val="20"/>
+              </w:rPr>
+              <w:t xml:space="preserve">Matriz de trazabilidad de requisitos (RTM) con evidencia de verificación</w:t>
+            </w:r>
+          </w:p>
+        </w:tc>
+        <w:tc>
+          <w:tcPr>
+            <w:tcW w:type="dxa" w:w="900"/>
+            <w:tcMar>
+              <w:top w:type="dxa" w:w="80"/>
+              <w:left w:type="dxa" w:w="120"/>
+              <w:bottom w:type="dxa" w:w="80"/>
+              <w:right w:type="dxa" w:w="120"/>
+            </w:tcMar>
+          </w:tcPr>
+          <w:p>
+            <w:pPr>
+              <w:spacing w:after="0"/>
+            </w:pPr>
+            <w:r>
+              <w:rPr>
+                <w:b w:val="false"/>
+                <w:bCs w:val="false"/>
+                <w:color w:val="1E293B"/>
+                <w:sz w:val="20"/>
+                <w:szCs w:val="20"/>
+              </w:rPr>
+              <w:t xml:space="preserve">✔</w:t>
+            </w:r>
+          </w:p>
+        </w:tc>
+        <w:tc>
+          <w:tcPr>
+            <w:tcW w:type="dxa" w:w="1150"/>
+            <w:tcMar>
+              <w:top w:type="dxa" w:w="80"/>
+              <w:left w:type="dxa" w:w="120"/>
+              <w:bottom w:type="dxa" w:w="80"/>
+              <w:right w:type="dxa" w:w="120"/>
+            </w:tcMar>
+          </w:tcPr>
+          <w:p>
+            <w:pPr>
+              <w:spacing w:after="0"/>
+            </w:pPr>
+            <w:r>
+              <w:rPr>
+                <w:b w:val="false"/>
+                <w:bCs w:val="false"/>
+                <w:color w:val="1E293B"/>
+                <w:sz w:val="20"/>
+                <w:szCs w:val="20"/>
+              </w:rPr>
+              <w:t xml:space="preserve">—</w:t>
+            </w:r>
+          </w:p>
+        </w:tc>
+        <w:tc>
+          <w:tcPr>
+            <w:tcW w:type="dxa" w:w="900"/>
+            <w:tcMar>
+              <w:top w:type="dxa" w:w="80"/>
+              <w:left w:type="dxa" w:w="120"/>
+              <w:bottom w:type="dxa" w:w="80"/>
+              <w:right w:type="dxa" w:w="120"/>
+            </w:tcMar>
+          </w:tcPr>
+          <w:p>
+            <w:pPr>
+              <w:spacing w:after="0"/>
+            </w:pPr>
+            <w:r>
+              <w:rPr>
+                <w:b w:val="false"/>
+                <w:bCs w:val="false"/>
+                <w:color w:val="1E293B"/>
+                <w:sz w:val="20"/>
+                <w:szCs w:val="20"/>
+              </w:rPr>
+              <w:t xml:space="preserve">—</w:t>
+            </w:r>
+          </w:p>
+        </w:tc>
+        <w:tc>
+          <w:tcPr>
+            <w:tcW w:type="dxa" w:w="800"/>
+            <w:tcMar>
+              <w:top w:type="dxa" w:w="80"/>
+              <w:left w:type="dxa" w:w="120"/>
+              <w:bottom w:type="dxa" w:w="80"/>
+              <w:right w:type="dxa" w:w="120"/>
+            </w:tcMar>
+          </w:tcPr>
+          <w:p>
+            <w:pPr>
+              <w:spacing w:after="0"/>
+            </w:pPr>
+            <w:r>
+              <w:rPr>
+                <w:b w:val="false"/>
+                <w:bCs w:val="false"/>
+                <w:color w:val="1E293B"/>
+                <w:sz w:val="20"/>
+                <w:szCs w:val="20"/>
+              </w:rPr>
+              <w:t xml:space="preserve">—</w:t>
+            </w:r>
+          </w:p>
+        </w:tc>
+        <w:tc>
+          <w:tcPr>
+            <w:tcW w:type="dxa" w:w="950"/>
+            <w:tcMar>
+              <w:top w:type="dxa" w:w="80"/>
+              <w:left w:type="dxa" w:w="120"/>
+              <w:bottom w:type="dxa" w:w="80"/>
+              <w:right w:type="dxa" w:w="120"/>
+            </w:tcMar>
+          </w:tcPr>
+          <w:p>
+            <w:pPr>
+              <w:spacing w:after="0"/>
+            </w:pPr>
+            <w:r>
+              <w:rPr>
+                <w:b w:val="false"/>
+                <w:bCs w:val="false"/>
+                <w:color w:val="1E293B"/>
+                <w:sz w:val="20"/>
+                <w:szCs w:val="20"/>
+              </w:rPr>
+              <w:t xml:space="preserve">◐</w:t>
+            </w:r>
+          </w:p>
+        </w:tc>
+        <w:tc>
+          <w:tcPr>
+            <w:tcW w:type="dxa" w:w="800"/>
+            <w:tcMar>
+              <w:top w:type="dxa" w:w="80"/>
+              <w:left w:type="dxa" w:w="120"/>
+              <w:bottom w:type="dxa" w:w="80"/>
+              <w:right w:type="dxa" w:w="120"/>
+            </w:tcMar>
+          </w:tcPr>
+          <w:p>
+            <w:pPr>
+              <w:spacing w:after="0"/>
+            </w:pPr>
+            <w:r>
+              <w:rPr>
+                <w:b w:val="false"/>
+                <w:bCs w:val="false"/>
+                <w:color w:val="1E293B"/>
+                <w:sz w:val="20"/>
+                <w:szCs w:val="20"/>
+              </w:rPr>
+              <w:t xml:space="preserve">◐</w:t>
+            </w:r>
+          </w:p>
+        </w:tc>
+        <w:tc>
+          <w:tcPr>
+            <w:tcW w:type="dxa" w:w="800"/>
+            <w:tcMar>
+              <w:top w:type="dxa" w:w="80"/>
+              <w:left w:type="dxa" w:w="120"/>
+              <w:bottom w:type="dxa" w:w="80"/>
+              <w:right w:type="dxa" w:w="120"/>
+            </w:tcMar>
+          </w:tcPr>
+          <w:p>
+            <w:pPr>
+              <w:spacing w:after="0"/>
+            </w:pPr>
+            <w:r>
+              <w:rPr>
+                <w:b w:val="false"/>
+                <w:bCs w:val="false"/>
+                <w:color w:val="1E293B"/>
+                <w:sz w:val="20"/>
+                <w:szCs w:val="20"/>
+              </w:rPr>
+              <w:t xml:space="preserve">—</w:t>
+            </w:r>
+          </w:p>
+        </w:tc>
+      </w:tr>
+      <w:tr>
+        <w:trPr>
+          <w:tblHeader w:val="false"/>
+        </w:trPr>
+        <w:tc>
+          <w:tcPr>
+            <w:tcW w:type="dxa" w:w="3200"/>
+            <w:tcMar>
+              <w:top w:type="dxa" w:w="80"/>
+              <w:left w:type="dxa" w:w="120"/>
+              <w:bottom w:type="dxa" w:w="80"/>
+              <w:right w:type="dxa" w:w="120"/>
+            </w:tcMar>
+          </w:tcPr>
+          <w:p>
+            <w:pPr>
+              <w:spacing w:after="0"/>
+            </w:pPr>
+            <w:r>
+              <w:rPr>
+                <w:b w:val="false"/>
+                <w:bCs w:val="false"/>
+                <w:color w:val="1E293B"/>
+                <w:sz w:val="20"/>
+                <w:szCs w:val="20"/>
+              </w:rPr>
+              <w:t xml:space="preserve">Minutas de reunión con PDF imprimible + borrador AI desde transcripts</w:t>
+            </w:r>
+          </w:p>
+        </w:tc>
+        <w:tc>
+          <w:tcPr>
+            <w:tcW w:type="dxa" w:w="900"/>
+            <w:tcMar>
+              <w:top w:type="dxa" w:w="80"/>
+              <w:left w:type="dxa" w:w="120"/>
+              <w:bottom w:type="dxa" w:w="80"/>
+              <w:right w:type="dxa" w:w="120"/>
+            </w:tcMar>
+          </w:tcPr>
+          <w:p>
+            <w:pPr>
+              <w:spacing w:after="0"/>
+            </w:pPr>
+            <w:r>
+              <w:rPr>
+                <w:b w:val="false"/>
+                <w:bCs w:val="false"/>
+                <w:color w:val="1E293B"/>
+                <w:sz w:val="20"/>
+                <w:szCs w:val="20"/>
+              </w:rPr>
+              <w:t xml:space="preserve">✔</w:t>
+            </w:r>
+          </w:p>
+        </w:tc>
+        <w:tc>
+          <w:tcPr>
+            <w:tcW w:type="dxa" w:w="1150"/>
+            <w:tcMar>
+              <w:top w:type="dxa" w:w="80"/>
+              <w:left w:type="dxa" w:w="120"/>
+              <w:bottom w:type="dxa" w:w="80"/>
+              <w:right w:type="dxa" w:w="120"/>
+            </w:tcMar>
+          </w:tcPr>
+          <w:p>
+            <w:pPr>
+              <w:spacing w:after="0"/>
+            </w:pPr>
+            <w:r>
+              <w:rPr>
+                <w:b w:val="false"/>
+                <w:bCs w:val="false"/>
+                <w:color w:val="1E293B"/>
+                <w:sz w:val="20"/>
+                <w:szCs w:val="20"/>
+              </w:rPr>
+              <w:t xml:space="preserve">—</w:t>
+            </w:r>
+          </w:p>
+        </w:tc>
+        <w:tc>
+          <w:tcPr>
+            <w:tcW w:type="dxa" w:w="900"/>
+            <w:tcMar>
+              <w:top w:type="dxa" w:w="80"/>
+              <w:left w:type="dxa" w:w="120"/>
+              <w:bottom w:type="dxa" w:w="80"/>
+              <w:right w:type="dxa" w:w="120"/>
+            </w:tcMar>
+          </w:tcPr>
+          <w:p>
+            <w:pPr>
+              <w:spacing w:after="0"/>
+            </w:pPr>
+            <w:r>
+              <w:rPr>
+                <w:b w:val="false"/>
+                <w:bCs w:val="false"/>
+                <w:color w:val="1E293B"/>
+                <w:sz w:val="20"/>
+                <w:szCs w:val="20"/>
+              </w:rPr>
+              <w:t xml:space="preserve">◐</w:t>
+            </w:r>
+          </w:p>
+        </w:tc>
+        <w:tc>
+          <w:tcPr>
+            <w:tcW w:type="dxa" w:w="800"/>
+            <w:tcMar>
+              <w:top w:type="dxa" w:w="80"/>
+              <w:left w:type="dxa" w:w="120"/>
+              <w:bottom w:type="dxa" w:w="80"/>
+              <w:right w:type="dxa" w:w="120"/>
+            </w:tcMar>
+          </w:tcPr>
+          <w:p>
+            <w:pPr>
+              <w:spacing w:after="0"/>
+            </w:pPr>
+            <w:r>
+              <w:rPr>
+                <w:b w:val="false"/>
+                <w:bCs w:val="false"/>
+                <w:color w:val="1E293B"/>
+                <w:sz w:val="20"/>
+                <w:szCs w:val="20"/>
+              </w:rPr>
+              <w:t xml:space="preserve">◐</w:t>
+            </w:r>
+          </w:p>
+        </w:tc>
+        <w:tc>
+          <w:tcPr>
+            <w:tcW w:type="dxa" w:w="950"/>
+            <w:tcMar>
+              <w:top w:type="dxa" w:w="80"/>
+              <w:left w:type="dxa" w:w="120"/>
+              <w:bottom w:type="dxa" w:w="80"/>
+              <w:right w:type="dxa" w:w="120"/>
+            </w:tcMar>
+          </w:tcPr>
+          <w:p>
+            <w:pPr>
+              <w:spacing w:after="0"/>
+            </w:pPr>
+            <w:r>
+              <w:rPr>
+                <w:b w:val="false"/>
+                <w:bCs w:val="false"/>
+                <w:color w:val="1E293B"/>
+                <w:sz w:val="20"/>
+                <w:szCs w:val="20"/>
+              </w:rPr>
+              <w:t xml:space="preserve">—</w:t>
+            </w:r>
+          </w:p>
+        </w:tc>
+        <w:tc>
+          <w:tcPr>
+            <w:tcW w:type="dxa" w:w="800"/>
+            <w:tcMar>
+              <w:top w:type="dxa" w:w="80"/>
+              <w:left w:type="dxa" w:w="120"/>
+              <w:bottom w:type="dxa" w:w="80"/>
+              <w:right w:type="dxa" w:w="120"/>
+            </w:tcMar>
+          </w:tcPr>
+          <w:p>
+            <w:pPr>
+              <w:spacing w:after="0"/>
+            </w:pPr>
+            <w:r>
+              <w:rPr>
+                <w:b w:val="false"/>
+                <w:bCs w:val="false"/>
+                <w:color w:val="1E293B"/>
+                <w:sz w:val="20"/>
+                <w:szCs w:val="20"/>
+              </w:rPr>
+              <w:t xml:space="preserve">◐</w:t>
+            </w:r>
+          </w:p>
+        </w:tc>
+        <w:tc>
+          <w:tcPr>
+            <w:tcW w:type="dxa" w:w="800"/>
+            <w:tcMar>
+              <w:top w:type="dxa" w:w="80"/>
+              <w:left w:type="dxa" w:w="120"/>
+              <w:bottom w:type="dxa" w:w="80"/>
+              <w:right w:type="dxa" w:w="120"/>
+            </w:tcMar>
+          </w:tcPr>
+          <w:p>
+            <w:pPr>
+              <w:spacing w:after="0"/>
+            </w:pPr>
+            <w:r>
+              <w:rPr>
+                <w:b w:val="false"/>
+                <w:bCs w:val="false"/>
+                <w:color w:val="1E293B"/>
+                <w:sz w:val="20"/>
+                <w:szCs w:val="20"/>
+              </w:rPr>
+              <w:t xml:space="preserve">◐</w:t>
+            </w:r>
+          </w:p>
+        </w:tc>
+      </w:tr>
+      <w:tr>
+        <w:trPr>
+          <w:tblHeader w:val="false"/>
+        </w:trPr>
+        <w:tc>
+          <w:tcPr>
+            <w:tcW w:type="dxa" w:w="3200"/>
+            <w:tcMar>
+              <w:top w:type="dxa" w:w="80"/>
+              <w:left w:type="dxa" w:w="120"/>
+              <w:bottom w:type="dxa" w:w="80"/>
+              <w:right w:type="dxa" w:w="120"/>
+            </w:tcMar>
+          </w:tcPr>
+          <w:p>
+            <w:pPr>
+              <w:spacing w:after="0"/>
+            </w:pPr>
+            <w:r>
+              <w:rPr>
+                <w:b w:val="false"/>
+                <w:bCs w:val="false"/>
+                <w:color w:val="1E293B"/>
+                <w:sz w:val="20"/>
+                <w:szCs w:val="20"/>
+              </w:rPr>
+              <w:t xml:space="preserve">Incubadora de ideas pre-proyecto con comparación ponderada de proveedores/soluciones</w:t>
+            </w:r>
+          </w:p>
+        </w:tc>
+        <w:tc>
+          <w:tcPr>
+            <w:tcW w:type="dxa" w:w="900"/>
+            <w:tcMar>
+              <w:top w:type="dxa" w:w="80"/>
+              <w:left w:type="dxa" w:w="120"/>
+              <w:bottom w:type="dxa" w:w="80"/>
+              <w:right w:type="dxa" w:w="120"/>
+            </w:tcMar>
+          </w:tcPr>
+          <w:p>
+            <w:pPr>
+              <w:spacing w:after="0"/>
+            </w:pPr>
+            <w:r>
+              <w:rPr>
+                <w:b w:val="false"/>
+                <w:bCs w:val="false"/>
+                <w:color w:val="1E293B"/>
+                <w:sz w:val="20"/>
+                <w:szCs w:val="20"/>
+              </w:rPr>
+              <w:t xml:space="preserve">✔</w:t>
+            </w:r>
+          </w:p>
+        </w:tc>
+        <w:tc>
+          <w:tcPr>
+            <w:tcW w:type="dxa" w:w="1150"/>
+            <w:tcMar>
+              <w:top w:type="dxa" w:w="80"/>
+              <w:left w:type="dxa" w:w="120"/>
+              <w:bottom w:type="dxa" w:w="80"/>
+              <w:right w:type="dxa" w:w="120"/>
+            </w:tcMar>
+          </w:tcPr>
+          <w:p>
+            <w:pPr>
+              <w:spacing w:after="0"/>
+            </w:pPr>
+            <w:r>
+              <w:rPr>
+                <w:b w:val="false"/>
+                <w:bCs w:val="false"/>
+                <w:color w:val="1E293B"/>
+                <w:sz w:val="20"/>
+                <w:szCs w:val="20"/>
+              </w:rPr>
+              <w:t xml:space="preserve">—</w:t>
+            </w:r>
+          </w:p>
+        </w:tc>
+        <w:tc>
+          <w:tcPr>
+            <w:tcW w:type="dxa" w:w="900"/>
+            <w:tcMar>
+              <w:top w:type="dxa" w:w="80"/>
+              <w:left w:type="dxa" w:w="120"/>
+              <w:bottom w:type="dxa" w:w="80"/>
+              <w:right w:type="dxa" w:w="120"/>
+            </w:tcMar>
+          </w:tcPr>
+          <w:p>
+            <w:pPr>
+              <w:spacing w:after="0"/>
+            </w:pPr>
+            <w:r>
+              <w:rPr>
+                <w:b w:val="false"/>
+                <w:bCs w:val="false"/>
+                <w:color w:val="1E293B"/>
+                <w:sz w:val="20"/>
+                <w:szCs w:val="20"/>
+              </w:rPr>
+              <w:t xml:space="preserve">◐</w:t>
+            </w:r>
+          </w:p>
+        </w:tc>
+        <w:tc>
+          <w:tcPr>
+            <w:tcW w:type="dxa" w:w="800"/>
+            <w:tcMar>
+              <w:top w:type="dxa" w:w="80"/>
+              <w:left w:type="dxa" w:w="120"/>
+              <w:bottom w:type="dxa" w:w="80"/>
+              <w:right w:type="dxa" w:w="120"/>
+            </w:tcMar>
+          </w:tcPr>
+          <w:p>
+            <w:pPr>
+              <w:spacing w:after="0"/>
+            </w:pPr>
+            <w:r>
+              <w:rPr>
+                <w:b w:val="false"/>
+                <w:bCs w:val="false"/>
+                <w:color w:val="1E293B"/>
+                <w:sz w:val="20"/>
+                <w:szCs w:val="20"/>
+              </w:rPr>
+              <w:t xml:space="preserve">◐</w:t>
+            </w:r>
+          </w:p>
+        </w:tc>
+        <w:tc>
+          <w:tcPr>
+            <w:tcW w:type="dxa" w:w="950"/>
+            <w:tcMar>
+              <w:top w:type="dxa" w:w="80"/>
+              <w:left w:type="dxa" w:w="120"/>
+              <w:bottom w:type="dxa" w:w="80"/>
+              <w:right w:type="dxa" w:w="120"/>
+            </w:tcMar>
+          </w:tcPr>
+          <w:p>
+            <w:pPr>
+              <w:spacing w:after="0"/>
+            </w:pPr>
+            <w:r>
+              <w:rPr>
+                <w:b w:val="false"/>
+                <w:bCs w:val="false"/>
+                <w:color w:val="1E293B"/>
+                <w:sz w:val="20"/>
+                <w:szCs w:val="20"/>
+              </w:rPr>
+              <w:t xml:space="preserve">—</w:t>
+            </w:r>
+          </w:p>
+        </w:tc>
+        <w:tc>
+          <w:tcPr>
+            <w:tcW w:type="dxa" w:w="800"/>
+            <w:tcMar>
+              <w:top w:type="dxa" w:w="80"/>
+              <w:left w:type="dxa" w:w="120"/>
+              <w:bottom w:type="dxa" w:w="80"/>
+              <w:right w:type="dxa" w:w="120"/>
+            </w:tcMar>
+          </w:tcPr>
+          <w:p>
+            <w:pPr>
+              <w:spacing w:after="0"/>
+            </w:pPr>
+            <w:r>
+              <w:rPr>
+                <w:b w:val="false"/>
+                <w:bCs w:val="false"/>
+                <w:color w:val="1E293B"/>
+                <w:sz w:val="20"/>
+                <w:szCs w:val="20"/>
+              </w:rPr>
+              <w:t xml:space="preserve">—</w:t>
+            </w:r>
+          </w:p>
+        </w:tc>
+        <w:tc>
+          <w:tcPr>
+            <w:tcW w:type="dxa" w:w="800"/>
+            <w:tcMar>
+              <w:top w:type="dxa" w:w="80"/>
+              <w:left w:type="dxa" w:w="120"/>
+              <w:bottom w:type="dxa" w:w="80"/>
+              <w:right w:type="dxa" w:w="120"/>
+            </w:tcMar>
+          </w:tcPr>
+          <w:p>
+            <w:pPr>
+              <w:spacing w:after="0"/>
+            </w:pPr>
+            <w:r>
+              <w:rPr>
+                <w:b w:val="false"/>
+                <w:bCs w:val="false"/>
+                <w:color w:val="1E293B"/>
+                <w:sz w:val="20"/>
+                <w:szCs w:val="20"/>
+              </w:rPr>
+              <w:t xml:space="preserve">◐</w:t>
+            </w:r>
+          </w:p>
+        </w:tc>
+      </w:tr>
+      <w:tr>
+        <w:trPr>
+          <w:tblHeader w:val="false"/>
+        </w:trPr>
+        <w:tc>
+          <w:tcPr>
+            <w:tcW w:type="dxa" w:w="3200"/>
+            <w:tcMar>
+              <w:top w:type="dxa" w:w="80"/>
+              <w:left w:type="dxa" w:w="120"/>
+              <w:bottom w:type="dxa" w:w="80"/>
+              <w:right w:type="dxa" w:w="120"/>
+            </w:tcMar>
+          </w:tcPr>
+          <w:p>
+            <w:pPr>
+              <w:spacing w:after="0"/>
+            </w:pPr>
+            <w:r>
+              <w:rPr>
+                <w:b w:val="false"/>
+                <w:bCs w:val="false"/>
+                <w:color w:val="1E293B"/>
+                <w:sz w:val="20"/>
+                <w:szCs w:val="20"/>
+              </w:rPr>
+              <w:t xml:space="preserve">Señales de presión de plazo (por vencer / vencidas) en la cuadrícula de tareas</w:t>
+            </w:r>
+          </w:p>
+        </w:tc>
+        <w:tc>
+          <w:tcPr>
+            <w:tcW w:type="dxa" w:w="900"/>
+            <w:tcMar>
+              <w:top w:type="dxa" w:w="80"/>
+              <w:left w:type="dxa" w:w="120"/>
+              <w:bottom w:type="dxa" w:w="80"/>
+              <w:right w:type="dxa" w:w="120"/>
+            </w:tcMar>
+          </w:tcPr>
+          <w:p>
+            <w:pPr>
+              <w:spacing w:after="0"/>
+            </w:pPr>
+            <w:r>
+              <w:rPr>
+                <w:b w:val="false"/>
+                <w:bCs w:val="false"/>
+                <w:color w:val="1E293B"/>
+                <w:sz w:val="20"/>
+                <w:szCs w:val="20"/>
+              </w:rPr>
+              <w:t xml:space="preserve">✔</w:t>
+            </w:r>
+          </w:p>
+        </w:tc>
+        <w:tc>
+          <w:tcPr>
+            <w:tcW w:type="dxa" w:w="1150"/>
+            <w:tcMar>
+              <w:top w:type="dxa" w:w="80"/>
+              <w:left w:type="dxa" w:w="120"/>
+              <w:bottom w:type="dxa" w:w="80"/>
+              <w:right w:type="dxa" w:w="120"/>
+            </w:tcMar>
+          </w:tcPr>
+          <w:p>
+            <w:pPr>
+              <w:spacing w:after="0"/>
+            </w:pPr>
+            <w:r>
+              <w:rPr>
+                <w:b w:val="false"/>
+                <w:bCs w:val="false"/>
+                <w:color w:val="1E293B"/>
+                <w:sz w:val="20"/>
+                <w:szCs w:val="20"/>
+              </w:rPr>
+              <w:t xml:space="preserve">◐</w:t>
+            </w:r>
+          </w:p>
+        </w:tc>
+        <w:tc>
+          <w:tcPr>
+            <w:tcW w:type="dxa" w:w="900"/>
+            <w:tcMar>
+              <w:top w:type="dxa" w:w="80"/>
+              <w:left w:type="dxa" w:w="120"/>
+              <w:bottom w:type="dxa" w:w="80"/>
+              <w:right w:type="dxa" w:w="120"/>
+            </w:tcMar>
+          </w:tcPr>
+          <w:p>
+            <w:pPr>
+              <w:spacing w:after="0"/>
+            </w:pPr>
+            <w:r>
+              <w:rPr>
+                <w:b w:val="false"/>
+                <w:bCs w:val="false"/>
+                <w:color w:val="1E293B"/>
+                <w:sz w:val="20"/>
+                <w:szCs w:val="20"/>
+              </w:rPr>
+              <w:t xml:space="preserve">✔</w:t>
+            </w:r>
+          </w:p>
+        </w:tc>
+        <w:tc>
+          <w:tcPr>
+            <w:tcW w:type="dxa" w:w="800"/>
+            <w:tcMar>
+              <w:top w:type="dxa" w:w="80"/>
+              <w:left w:type="dxa" w:w="120"/>
+              <w:bottom w:type="dxa" w:w="80"/>
+              <w:right w:type="dxa" w:w="120"/>
+            </w:tcMar>
+          </w:tcPr>
+          <w:p>
+            <w:pPr>
+              <w:spacing w:after="0"/>
+            </w:pPr>
+            <w:r>
+              <w:rPr>
+                <w:b w:val="false"/>
+                <w:bCs w:val="false"/>
+                <w:color w:val="1E293B"/>
+                <w:sz w:val="20"/>
+                <w:szCs w:val="20"/>
+              </w:rPr>
+              <w:t xml:space="preserve">✔</w:t>
+            </w:r>
+          </w:p>
+        </w:tc>
+        <w:tc>
+          <w:tcPr>
+            <w:tcW w:type="dxa" w:w="950"/>
+            <w:tcMar>
+              <w:top w:type="dxa" w:w="80"/>
+              <w:left w:type="dxa" w:w="120"/>
+              <w:bottom w:type="dxa" w:w="80"/>
+              <w:right w:type="dxa" w:w="120"/>
+            </w:tcMar>
+          </w:tcPr>
+          <w:p>
+            <w:pPr>
+              <w:spacing w:after="0"/>
+            </w:pPr>
+            <w:r>
+              <w:rPr>
+                <w:b w:val="false"/>
+                <w:bCs w:val="false"/>
+                <w:color w:val="1E293B"/>
+                <w:sz w:val="20"/>
+                <w:szCs w:val="20"/>
+              </w:rPr>
+              <w:t xml:space="preserve">✔</w:t>
+            </w:r>
+          </w:p>
+        </w:tc>
+        <w:tc>
+          <w:tcPr>
+            <w:tcW w:type="dxa" w:w="800"/>
+            <w:tcMar>
+              <w:top w:type="dxa" w:w="80"/>
+              <w:left w:type="dxa" w:w="120"/>
+              <w:bottom w:type="dxa" w:w="80"/>
+              <w:right w:type="dxa" w:w="120"/>
+            </w:tcMar>
+          </w:tcPr>
+          <w:p>
+            <w:pPr>
+              <w:spacing w:after="0"/>
+            </w:pPr>
+            <w:r>
+              <w:rPr>
+                <w:b w:val="false"/>
+                <w:bCs w:val="false"/>
+                <w:color w:val="1E293B"/>
+                <w:sz w:val="20"/>
+                <w:szCs w:val="20"/>
+              </w:rPr>
+              <w:t xml:space="preserve">✔</w:t>
+            </w:r>
+          </w:p>
+        </w:tc>
+        <w:tc>
+          <w:tcPr>
+            <w:tcW w:type="dxa" w:w="800"/>
+            <w:tcMar>
+              <w:top w:type="dxa" w:w="80"/>
+              <w:left w:type="dxa" w:w="120"/>
+              <w:bottom w:type="dxa" w:w="80"/>
+              <w:right w:type="dxa" w:w="120"/>
+            </w:tcMar>
+          </w:tcPr>
+          <w:p>
+            <w:pPr>
+              <w:spacing w:after="0"/>
+            </w:pPr>
+            <w:r>
+              <w:rPr>
+                <w:b w:val="false"/>
+                <w:bCs w:val="false"/>
+                <w:color w:val="1E293B"/>
+                <w:sz w:val="20"/>
+                <w:szCs w:val="20"/>
+              </w:rPr>
+              <w:t xml:space="preserve">✔</w:t>
             </w:r>
           </w:p>
         </w:tc>
@@ -3172,6 +4450,32 @@
     </w:p>
     <w:p>
       <w:pPr>
+        <w:pStyle w:val="Heading2"/>
+      </w:pPr>
+      <w:r>
+        <w:t xml:space="preserve">3.7 IA con controles de gobernanza</w:t>
+      </w:r>
+    </w:p>
+    <w:p>
+      <w:r>
+        <w:t xml:space="preserve">Toda función de IA (importación de planes, escaneo de documentos, borrador de minutas, generación de reportes) es asistiva y con revisión humana. Los administradores del workspace pueden desactivar toda la IA con un interruptor del lado del servidor, y cada llamada y bloqueo de IA queda en un registro de auditoría por workspace. Los datos del cliente nunca se usan para entrenar modelos, y un Anexo de Procesamiento de Datos cubre el subprocesamiento de IA. Los competidores añaden IA rápido; ninguno de los comparados ofrece un apagado controlado por el cliente con rastro de auditoría — el control que una revisión de política de IA pide primero.</w:t>
+      </w:r>
+    </w:p>
+    <w:p>
+      <w:pPr>
+        <w:pStyle w:val="Heading2"/>
+      </w:pPr>
+      <w:r>
+        <w:t xml:space="preserve">3.8 El contrato es parte del producto</w:t>
+      </w:r>
+    </w:p>
+    <w:p>
+      <w:r>
+        <w:t xml:space="preserve">Los clientes Enterprise tienen su contrato dentro de FlowSync PM: precios negociados de sillas y paquetes, bloques de servicio prepagados con saldo de horas, hitos de onboarding y facturación desde trabajo registrado — primera factura, incrementos a mitad de término prorrateados por meses restantes, y renovaciones — con Acuerdo Empresarial imprimible y PDFs de factura. Las herramientas comparadas facturan por un portal aparte; el contrato nunca toca los datos de entrega.</w:t>
+      </w:r>
+    </w:p>
+    <w:p>
+      <w:pPr>
         <w:pStyle w:val="Heading1"/>
       </w:pPr>
       <w:r>
@@ -3630,10 +4934,7 @@
           <w:b/>
           <w:bCs/>
         </w:rPr>
-        <w:t xml:space="preserve">Puntos de prueba de la demo, en orden: </w:t>
-      </w:r>
-      <w:r>
-        <w:t xml:space="preserve">(1) importar un plan real en minutos, (2) OCR de una cotización escaneada, (3) captura de correo/reunión en el Smart Inbox, (4) reporte ejecutivo de un clic con EVM.</w:t>
+        <w:t xml:space="preserve">Puntos de prueba del demo, en orden: (1) importar un plan real en minutos, (2) escanear un transcript de reunión a borrador de minuta, (3) OCR de una cotización escaneada a matriz de comparación, (4) reporte ejecutivo de un clic con EVM, (5) mostrar el apagado de IA y el registro de auditoría.</w:t>
       </w:r>
     </w:p>
     <w:sectPr>

</xml_diff>